<commit_message>
Update embedded hardware document
</commit_message>
<xml_diff>
--- a/Csip_OA_Embedded_Hardware_Firmware_2.docx
+++ b/Csip_OA_Embedded_Hardware_Firmware_2.docx
@@ -995,6 +995,27 @@
     </w:p>
     <w:p>
       <w:pPr>
+        <w:suppressAutoHyphens w:val="0"/>
+        <w:spacing w:line="240" w:lineRule="auto"/>
+        <w:ind w:leftChars="0" w:left="0" w:firstLineChars="0" w:firstLine="0"/>
+        <w:textDirection w:val="lrTb"/>
+        <w:textAlignment w:val="auto"/>
+        <w:outlineLvl w:val="9"/>
+        <w:rPr>
+          <w:b/>
+          <w:color w:val="000000"/>
+        </w:rPr>
+      </w:pPr>
+      <w:r>
+        <w:rPr>
+          <w:b/>
+          <w:color w:val="000000"/>
+        </w:rPr>
+        <w:br w:type="page"/>
+      </w:r>
+    </w:p>
+    <w:p>
+      <w:pPr>
         <w:ind w:left="0" w:hanging="2"/>
         <w:rPr>
           <w:b/>
@@ -1072,7 +1093,6 @@
         <w:ind w:leftChars="0" w:firstLineChars="0"/>
       </w:pPr>
       <w:r>
-        <w:lastRenderedPageBreak/>
         <w:t>Air Pump: 6</w:t>
       </w:r>
       <w:r>
@@ -1093,19 +1113,7 @@
           <w:rPr>
             <w:rStyle w:val="Hyperlink"/>
           </w:rPr>
-          <w:t>KNF NMP09KPD</w:t>
-        </w:r>
-        <w:r>
-          <w:rPr>
-            <w:rStyle w:val="Hyperlink"/>
-          </w:rPr>
-          <w:t>C</w:t>
-        </w:r>
-        <w:r>
-          <w:rPr>
-            <w:rStyle w:val="Hyperlink"/>
-          </w:rPr>
-          <w:t>-B 6V</w:t>
+          <w:t>KNF NMP09KPDC-B 6V</w:t>
         </w:r>
       </w:hyperlink>
     </w:p>
@@ -1150,19 +1158,7 @@
           <w:rPr>
             <w:rStyle w:val="Hyperlink"/>
           </w:rPr>
-          <w:t xml:space="preserve"> </w:t>
-        </w:r>
-        <w:r>
-          <w:rPr>
-            <w:rStyle w:val="Hyperlink"/>
-          </w:rPr>
-          <w:t>R</w:t>
-        </w:r>
-        <w:r>
-          <w:rPr>
-            <w:rStyle w:val="Hyperlink"/>
-          </w:rPr>
-          <w:t>P-TX</w:t>
+          <w:t xml:space="preserve"> RP-TX</w:t>
         </w:r>
       </w:hyperlink>
     </w:p>
@@ -1184,19 +1180,7 @@
           <w:rPr>
             <w:rStyle w:val="Hyperlink"/>
           </w:rPr>
-          <w:t>SB</w:t>
-        </w:r>
-        <w:r>
-          <w:rPr>
-            <w:rStyle w:val="Hyperlink"/>
-          </w:rPr>
-          <w:t>E</w:t>
-        </w:r>
-        <w:r>
-          <w:rPr>
-            <w:rStyle w:val="Hyperlink"/>
-          </w:rPr>
-          <w:t>5P</w:t>
+          <w:t>SBE5P</w:t>
         </w:r>
       </w:hyperlink>
     </w:p>
@@ -1404,6 +1388,9 @@
       <w:r>
         <w:t>Input voltage: 12-30 VDC</w:t>
       </w:r>
+      <w:r>
+        <w:t xml:space="preserve"> (Use 12V)</w:t>
+      </w:r>
     </w:p>
     <w:p>
       <w:pPr>
@@ -1511,6 +1498,9 @@
       </w:pPr>
       <w:r>
         <w:t>Wall-power</w:t>
+      </w:r>
+      <w:r>
+        <w:t>: not supplied by the board.</w:t>
       </w:r>
     </w:p>
     <w:p>
@@ -1541,19 +1531,7 @@
           <w:rPr>
             <w:rStyle w:val="Hyperlink"/>
           </w:rPr>
-          <w:t xml:space="preserve"> ADMONT K</w:t>
-        </w:r>
-        <w:r>
-          <w:rPr>
-            <w:rStyle w:val="Hyperlink"/>
-          </w:rPr>
-          <w:t>9</w:t>
-        </w:r>
-        <w:r>
-          <w:rPr>
-            <w:rStyle w:val="Hyperlink"/>
-          </w:rPr>
-          <w:t>6</w:t>
+          <w:t xml:space="preserve"> ADMONT K96</w:t>
         </w:r>
       </w:hyperlink>
     </w:p>
@@ -3305,6 +3283,7 @@
   <w:style w:type="character" w:default="1" w:styleId="DefaultParagraphFont">
     <w:name w:val="Default Paragraph Font"/>
     <w:uiPriority w:val="1"/>
+    <w:semiHidden/>
     <w:unhideWhenUsed/>
   </w:style>
   <w:style w:type="table" w:default="1" w:styleId="TableNormal">

</xml_diff>

<commit_message>
added 5V and 6V power rails
</commit_message>
<xml_diff>
--- a/Csip_OA_Embedded_Hardware_Firmware_2.docx
+++ b/Csip_OA_Embedded_Hardware_Firmware_2.docx
@@ -10,19 +10,11 @@
           <w:b/>
         </w:rPr>
       </w:pPr>
-      <w:proofErr w:type="spellStart"/>
       <w:r>
         <w:rPr>
           <w:b/>
         </w:rPr>
-        <w:t>Csip</w:t>
-      </w:r>
-      <w:proofErr w:type="spellEnd"/>
-      <w:r>
-        <w:rPr>
-          <w:b/>
-        </w:rPr>
-        <w:t>-OA Instrument: Embedded Electronics Design and Firmware</w:t>
+        <w:t>Csip-OA Instrument: Embedded Electronics Design and Firmware</w:t>
       </w:r>
     </w:p>
     <w:p>
@@ -55,21 +47,7 @@
         <w:rPr>
           <w:color w:val="000000"/>
         </w:rPr>
-        <w:t xml:space="preserve">PMEL’s </w:t>
-      </w:r>
-      <w:proofErr w:type="spellStart"/>
-      <w:r>
-        <w:rPr>
-          <w:color w:val="000000"/>
-        </w:rPr>
-        <w:t>Csip</w:t>
-      </w:r>
-      <w:proofErr w:type="spellEnd"/>
-      <w:r>
-        <w:rPr>
-          <w:color w:val="000000"/>
-        </w:rPr>
-        <w:t>-OA ocean carbon instrument, currently under development, allows researchers to autonomously monitor the movement of CO</w:t>
+        <w:t>PMEL’s Csip-OA ocean carbon instrument, currently under development, allows researchers to autonomously monitor the movement of CO</w:t>
       </w:r>
       <w:r>
         <w:rPr>
@@ -119,21 +97,7 @@
         <w:rPr>
           <w:color w:val="000000"/>
         </w:rPr>
-        <w:t xml:space="preserve"> gas in the atmosphere at the ocean’s surface and dissolved in the ocean, as well as the total Dissolved Inorganic Carbon (DIC) in the ocean.  By measuring these two carbon parameters, scientists can fully define the ocean carbon chemistry at the point of measurement.  The </w:t>
-      </w:r>
-      <w:proofErr w:type="spellStart"/>
-      <w:r>
-        <w:rPr>
-          <w:color w:val="000000"/>
-        </w:rPr>
-        <w:t>Csip</w:t>
-      </w:r>
-      <w:proofErr w:type="spellEnd"/>
-      <w:r>
-        <w:rPr>
-          <w:color w:val="000000"/>
-        </w:rPr>
-        <w:t xml:space="preserve">-OA instrumentation is the next generation replacement for two operational instruments developed at PMEL, and currently deployed worldwide, the </w:t>
+        <w:t xml:space="preserve"> gas in the atmosphere at the ocean’s surface and dissolved in the ocean, as well as the total Dissolved Inorganic Carbon (DIC) in the ocean.  By measuring these two carbon parameters, scientists can fully define the ocean carbon chemistry at the point of measurement.  The Csip-OA instrumentation is the next generation replacement for two operational instruments developed at PMEL, and currently deployed worldwide, the </w:t>
       </w:r>
       <w:hyperlink r:id="rId7">
         <w:r>
@@ -210,21 +174,7 @@
         <w:rPr>
           <w:color w:val="000000"/>
         </w:rPr>
-        <w:t xml:space="preserve">) and calibrate themselves.  PMEL has a benchtop prototype </w:t>
-      </w:r>
-      <w:proofErr w:type="spellStart"/>
-      <w:r>
-        <w:rPr>
-          <w:color w:val="000000"/>
-        </w:rPr>
-        <w:t>Csip</w:t>
-      </w:r>
-      <w:proofErr w:type="spellEnd"/>
-      <w:r>
-        <w:rPr>
-          <w:color w:val="000000"/>
-        </w:rPr>
-        <w:t>-OA instrument that uses Commercial-Off-The-Shelf (COTS) industrial controllers and lab view code.  This highly configurable benchtop prototype is being used to refine the design and instrument methodology in preparation for developing the low power, autonomous, embedded instrument, which will be the focus of this effort.</w:t>
+        <w:t>) and calibrate themselves.  PMEL has a benchtop prototype Csip-OA instrument that uses Commercial-Off-The-Shelf (COTS) industrial controllers and lab view code.  This highly configurable benchtop prototype is being used to refine the design and instrument methodology in preparation for developing the low power, autonomous, embedded instrument, which will be the focus of this effort.</w:t>
       </w:r>
       <w:r>
         <w:rPr>
@@ -237,35 +187,7 @@
           <w:rPr>
             <w:rStyle w:val="Hyperlink"/>
           </w:rPr>
-          <w:t xml:space="preserve">The Benchtop version’s code and information can be found on the  EDD_DIC/ </w:t>
-        </w:r>
-        <w:proofErr w:type="spellStart"/>
-        <w:r>
-          <w:rPr>
-            <w:rStyle w:val="Hyperlink"/>
-          </w:rPr>
-          <w:t>dev_testact</w:t>
-        </w:r>
-        <w:proofErr w:type="spellEnd"/>
-        <w:r>
-          <w:rPr>
-            <w:rStyle w:val="Hyperlink"/>
-          </w:rPr>
-          <w:t xml:space="preserve"> </w:t>
-        </w:r>
-        <w:proofErr w:type="spellStart"/>
-        <w:r>
-          <w:rPr>
-            <w:rStyle w:val="Hyperlink"/>
-          </w:rPr>
-          <w:t>Github</w:t>
-        </w:r>
-        <w:proofErr w:type="spellEnd"/>
-        <w:r>
-          <w:rPr>
-            <w:rStyle w:val="Hyperlink"/>
-          </w:rPr>
-          <w:t xml:space="preserve"> Repository.</w:t>
+          <w:t>The Benchtop version’s code and information can be found on the  EDD_DIC/ dev_testact Github Repository.</w:t>
         </w:r>
       </w:hyperlink>
     </w:p>
@@ -313,27 +235,14 @@
         </w:numPr>
         <w:ind w:leftChars="0" w:firstLineChars="0"/>
       </w:pPr>
-      <w:proofErr w:type="spellStart"/>
-      <w:r>
-        <w:t>Csip</w:t>
-      </w:r>
-      <w:proofErr w:type="spellEnd"/>
-      <w:r>
-        <w:t xml:space="preserve">-OA CCA(s) Design: </w:t>
+      <w:r>
+        <w:t xml:space="preserve">Csip-OA CCA(s) Design: </w:t>
       </w:r>
       <w:r>
         <w:t>E</w:t>
       </w:r>
       <w:r>
-        <w:t xml:space="preserve">mbedded ultra-low-power electronics Circuit Card Assembly(s) (CCA) design package for the </w:t>
-      </w:r>
-      <w:proofErr w:type="spellStart"/>
-      <w:r>
-        <w:t>Csip</w:t>
-      </w:r>
-      <w:proofErr w:type="spellEnd"/>
-      <w:r>
-        <w:t xml:space="preserve">-OA instrument. </w:t>
+        <w:t xml:space="preserve">mbedded ultra-low-power electronics Circuit Card Assembly(s) (CCA) design package for the Csip-OA instrument. </w:t>
       </w:r>
       <w:r>
         <w:t>The design goal will aim to achieve autonomous operation in an ocean environment subjected to vibration and shock and temperatures between 0 deg. C and 60 deg. C for a minimum of 400 days without failure.</w:t>
@@ -348,27 +257,14 @@
         </w:numPr>
         <w:ind w:leftChars="0" w:firstLineChars="0"/>
       </w:pPr>
-      <w:proofErr w:type="spellStart"/>
-      <w:r>
-        <w:t>Csip</w:t>
-      </w:r>
-      <w:proofErr w:type="spellEnd"/>
-      <w:r>
-        <w:t xml:space="preserve">-OA Firmware Package: </w:t>
+      <w:r>
+        <w:t xml:space="preserve">Csip-OA Firmware Package: </w:t>
       </w:r>
       <w:r>
         <w:t>E</w:t>
       </w:r>
       <w:r>
-        <w:t xml:space="preserve">mbedded command and control firmware for the </w:t>
-      </w:r>
-      <w:proofErr w:type="spellStart"/>
-      <w:r>
-        <w:t>Csip</w:t>
-      </w:r>
-      <w:proofErr w:type="spellEnd"/>
-      <w:r>
-        <w:t>-OA</w:t>
+        <w:t>mbedded command and control firmware for the Csip-OA</w:t>
       </w:r>
       <w:r>
         <w:t xml:space="preserve">.  </w:t>
@@ -403,48 +299,18 @@
         <w:ind w:left="0" w:hanging="2"/>
       </w:pPr>
       <w:r>
-        <w:t xml:space="preserve">The </w:t>
-      </w:r>
-      <w:proofErr w:type="spellStart"/>
-      <w:r>
-        <w:t>Csip</w:t>
-      </w:r>
-      <w:proofErr w:type="spellEnd"/>
-      <w:r>
-        <w:t xml:space="preserve">-OA sensor will operate very similarly to the ASVCO2 Gen2 Instrument, for details see </w:t>
+        <w:t xml:space="preserve">The Csip-OA sensor will operate very similarly to the ASVCO2 Gen2 Instrument, for details see </w:t>
       </w:r>
       <w:hyperlink r:id="rId13" w:history="1">
         <w:r>
           <w:rPr>
             <w:rStyle w:val="Hyperlink"/>
           </w:rPr>
-          <w:t xml:space="preserve">the ASVCO2 Gen2 </w:t>
-        </w:r>
-        <w:proofErr w:type="spellStart"/>
-        <w:r>
-          <w:rPr>
-            <w:rStyle w:val="Hyperlink"/>
-          </w:rPr>
-          <w:t>Github</w:t>
-        </w:r>
-        <w:proofErr w:type="spellEnd"/>
-        <w:r>
-          <w:rPr>
-            <w:rStyle w:val="Hyperlink"/>
-          </w:rPr>
-          <w:t xml:space="preserve"> repository</w:t>
+          <w:t>the ASVCO2 Gen2 Github repository</w:t>
         </w:r>
       </w:hyperlink>
       <w:r>
-        <w:t xml:space="preserve">.  The sensor will be powered and controlled by an external data logging and telemetry system.  When given a take sample command, the </w:t>
-      </w:r>
-      <w:proofErr w:type="spellStart"/>
-      <w:r>
-        <w:t>Csip</w:t>
-      </w:r>
-      <w:proofErr w:type="spellEnd"/>
-      <w:r>
-        <w:t>-OA will walk through a series of instrument states, much like the ASVCO2 sensor:</w:t>
+        <w:t>.  The sensor will be powered and controlled by an external data logging and telemetry system.  When given a take sample command, the Csip-OA will walk through a series of instrument states, much like the ASVCO2 sensor:</w:t>
       </w:r>
     </w:p>
     <w:p>
@@ -617,15 +483,7 @@
         <w:ind w:leftChars="0" w:firstLineChars="0"/>
       </w:pPr>
       <w:r>
-        <w:t xml:space="preserve">To get the DIC measurement value, instrument data will be processed on shore using a </w:t>
-      </w:r>
-      <w:proofErr w:type="spellStart"/>
-      <w:r>
-        <w:t>Matlab</w:t>
-      </w:r>
-      <w:proofErr w:type="spellEnd"/>
-      <w:r>
-        <w:t xml:space="preserve"> or Python Program.  We should experiment with doing this calculation onboard the instrument, but I believe this will not be possible.</w:t>
+        <w:t>To get the DIC measurement value, instrument data will be processed on shore using a Matlab or Python Program.  We should experiment with doing this calculation onboard the instrument, but I believe this will not be possible.</w:t>
       </w:r>
     </w:p>
     <w:p>
@@ -642,15 +500,7 @@
         <w:ind w:left="0" w:hanging="2"/>
       </w:pPr>
       <w:r>
-        <w:t xml:space="preserve">There will be 3 main variants of the </w:t>
-      </w:r>
-      <w:proofErr w:type="spellStart"/>
-      <w:r>
-        <w:t>Csip</w:t>
-      </w:r>
-      <w:proofErr w:type="spellEnd"/>
-      <w:r>
-        <w:t xml:space="preserve">-OA sensor.  Each variant should share the electronics hardware and firmware, but will differ slightly in the structure of </w:t>
+        <w:t xml:space="preserve">There will be 3 main variants of the Csip-OA sensor.  Each variant should share the electronics hardware and firmware, but will differ slightly in the structure of </w:t>
       </w:r>
       <w:r>
         <w:t>instrument states, the type of gas sensor that is integrated, the number of valves required, and the number of reference gases that are attached (0-4).  Here is an overview of the different configurations</w:t>
@@ -707,13 +557,8 @@
         </w:numPr>
         <w:ind w:leftChars="0" w:firstLineChars="0"/>
       </w:pPr>
-      <w:proofErr w:type="spellStart"/>
-      <w:r>
-        <w:t>Licor</w:t>
-      </w:r>
-      <w:proofErr w:type="spellEnd"/>
-      <w:r>
-        <w:t xml:space="preserve"> LI-830 gas sensor</w:t>
+      <w:r>
+        <w:t>Licor LI-830 gas sensor</w:t>
       </w:r>
     </w:p>
     <w:p>
@@ -777,21 +622,8 @@
         </w:numPr>
         <w:ind w:leftChars="0" w:firstLineChars="0"/>
       </w:pPr>
-      <w:proofErr w:type="spellStart"/>
-      <w:r>
-        <w:t>Senseair</w:t>
-      </w:r>
-      <w:proofErr w:type="spellEnd"/>
-      <w:r>
-        <w:t xml:space="preserve"> </w:t>
-      </w:r>
-      <w:proofErr w:type="spellStart"/>
-      <w:r>
-        <w:t>Admont</w:t>
-      </w:r>
-      <w:proofErr w:type="spellEnd"/>
-      <w:r>
-        <w:t xml:space="preserve"> K96 gas sensor</w:t>
+      <w:r>
+        <w:t>Senseair Admont K96 gas sensor</w:t>
       </w:r>
     </w:p>
     <w:p>
@@ -842,13 +674,8 @@
         </w:numPr>
         <w:ind w:leftChars="0" w:firstLineChars="0"/>
       </w:pPr>
-      <w:proofErr w:type="spellStart"/>
-      <w:r>
-        <w:t>Licor</w:t>
-      </w:r>
-      <w:proofErr w:type="spellEnd"/>
-      <w:r>
-        <w:t xml:space="preserve"> </w:t>
+      <w:r>
+        <w:t xml:space="preserve">Licor </w:t>
       </w:r>
       <w:r>
         <w:t>LI</w:t>
@@ -1091,6 +918,11 @@
           <w:numId w:val="8"/>
         </w:numPr>
         <w:ind w:leftChars="0" w:firstLineChars="0"/>
+        <w:rPr>
+          <w:rStyle w:val="Hyperlink"/>
+          <w:color w:val="auto"/>
+          <w:u w:val="none"/>
+        </w:rPr>
       </w:pPr>
       <w:r>
         <w:t>Air Pump: 6</w:t>
@@ -1113,9 +945,39 @@
           <w:rPr>
             <w:rStyle w:val="Hyperlink"/>
           </w:rPr>
-          <w:t>KNF NMP09KPDC-B 6V</w:t>
+          <w:t>KNF NMP09KP</w:t>
+        </w:r>
+        <w:r>
+          <w:rPr>
+            <w:rStyle w:val="Hyperlink"/>
+          </w:rPr>
+          <w:t>D</w:t>
+        </w:r>
+        <w:r>
+          <w:rPr>
+            <w:rStyle w:val="Hyperlink"/>
+          </w:rPr>
+          <w:t>C-B 6V</w:t>
         </w:r>
       </w:hyperlink>
+    </w:p>
+    <w:p>
+      <w:pPr>
+        <w:pStyle w:val="ListParagraph"/>
+        <w:numPr>
+          <w:ilvl w:val="1"/>
+          <w:numId w:val="8"/>
+        </w:numPr>
+        <w:ind w:leftChars="0" w:firstLineChars="0"/>
+      </w:pPr>
+      <w:r>
+        <w:rPr>
+          <w:rStyle w:val="Hyperlink"/>
+          <w:color w:val="auto"/>
+          <w:u w:val="none"/>
+        </w:rPr>
+        <w:t>Potential 12V option (KNF NMP15KPDC-B 12V)</w:t>
+      </w:r>
     </w:p>
     <w:p>
       <w:pPr>
@@ -1198,19 +1060,11 @@
         <w:t xml:space="preserve">Linear Actuators (x2): </w:t>
       </w:r>
       <w:hyperlink r:id="rId20" w:history="1">
-        <w:proofErr w:type="spellStart"/>
         <w:r>
           <w:rPr>
             <w:rStyle w:val="Hyperlink"/>
           </w:rPr>
-          <w:t>Actuonix</w:t>
-        </w:r>
-        <w:proofErr w:type="spellEnd"/>
-        <w:r>
-          <w:rPr>
-            <w:rStyle w:val="Hyperlink"/>
-          </w:rPr>
-          <w:t xml:space="preserve"> P16-50-256-12-P</w:t>
+          <w:t>Actuonix P16-50-256-12-P</w:t>
         </w:r>
       </w:hyperlink>
     </w:p>
@@ -1285,19 +1139,11 @@
         <w:t xml:space="preserve">AT/RH Sensor: </w:t>
       </w:r>
       <w:hyperlink r:id="rId22" w:history="1">
-        <w:proofErr w:type="spellStart"/>
         <w:r>
           <w:rPr>
             <w:rStyle w:val="Hyperlink"/>
           </w:rPr>
-          <w:t>Sensirion</w:t>
-        </w:r>
-        <w:proofErr w:type="spellEnd"/>
-        <w:r>
-          <w:rPr>
-            <w:rStyle w:val="Hyperlink"/>
-          </w:rPr>
-          <w:t xml:space="preserve"> SHT35</w:t>
+          <w:t>Sensirion SHT35</w:t>
         </w:r>
       </w:hyperlink>
     </w:p>
@@ -1319,21 +1165,7 @@
           <w:rPr>
             <w:rStyle w:val="Hyperlink"/>
           </w:rPr>
-          <w:t xml:space="preserve">SST Sensing </w:t>
-        </w:r>
-        <w:proofErr w:type="spellStart"/>
-        <w:r>
-          <w:rPr>
-            <w:rStyle w:val="Hyperlink"/>
-          </w:rPr>
-          <w:t>LuminOx</w:t>
-        </w:r>
-        <w:proofErr w:type="spellEnd"/>
-        <w:r>
-          <w:rPr>
-            <w:rStyle w:val="Hyperlink"/>
-          </w:rPr>
-          <w:t xml:space="preserve"> LOX-O2-F</w:t>
+          <w:t>SST Sensing LuminOx LOX-O2-F</w:t>
         </w:r>
       </w:hyperlink>
     </w:p>
@@ -1519,19 +1351,11 @@
         </w:rPr>
       </w:pPr>
       <w:hyperlink r:id="rId26" w:history="1">
-        <w:proofErr w:type="spellStart"/>
         <w:r>
           <w:rPr>
             <w:rStyle w:val="Hyperlink"/>
           </w:rPr>
-          <w:t>Senseair</w:t>
-        </w:r>
-        <w:proofErr w:type="spellEnd"/>
-        <w:r>
-          <w:rPr>
-            <w:rStyle w:val="Hyperlink"/>
-          </w:rPr>
-          <w:t xml:space="preserve"> ADMONT K96</w:t>
+          <w:t>Senseair ADMONT K96</w:t>
         </w:r>
       </w:hyperlink>
     </w:p>
@@ -1544,6 +1368,11 @@
         </w:numPr>
         <w:ind w:leftChars="0" w:firstLineChars="0"/>
         <w:jc w:val="both"/>
+        <w:rPr>
+          <w:rStyle w:val="Hyperlink"/>
+          <w:color w:val="auto"/>
+          <w:u w:val="none"/>
+        </w:rPr>
       </w:pPr>
       <w:r>
         <w:rPr>
@@ -1551,6 +1380,24 @@
           <w:u w:val="none"/>
         </w:rPr>
         <w:t>6-8.5V @ 300mA</w:t>
+      </w:r>
+    </w:p>
+    <w:p>
+      <w:pPr>
+        <w:pStyle w:val="ListParagraph"/>
+        <w:numPr>
+          <w:ilvl w:val="1"/>
+          <w:numId w:val="11"/>
+        </w:numPr>
+        <w:ind w:leftChars="0" w:firstLineChars="0"/>
+        <w:jc w:val="both"/>
+      </w:pPr>
+      <w:r>
+        <w:rPr>
+          <w:rStyle w:val="Hyperlink"/>
+          <w:u w:val="none"/>
+        </w:rPr>
+        <w:t>Needs 6.6V minimum</w:t>
       </w:r>
     </w:p>
     <w:sectPr>

</xml_diff>

<commit_message>
Added Sheets for pumps and sensors
</commit_message>
<xml_diff>
--- a/Csip_OA_Embedded_Hardware_Firmware_2.docx
+++ b/Csip_OA_Embedded_Hardware_Firmware_2.docx
@@ -945,19 +945,7 @@
           <w:rPr>
             <w:rStyle w:val="Hyperlink"/>
           </w:rPr>
-          <w:t>KNF NMP09KP</w:t>
-        </w:r>
-        <w:r>
-          <w:rPr>
-            <w:rStyle w:val="Hyperlink"/>
-          </w:rPr>
-          <w:t>D</w:t>
-        </w:r>
-        <w:r>
-          <w:rPr>
-            <w:rStyle w:val="Hyperlink"/>
-          </w:rPr>
-          <w:t>C-B 6V</w:t>
+          <w:t>KNF NMP09KPDC-B 6V</w:t>
         </w:r>
       </w:hyperlink>
     </w:p>
@@ -1023,6 +1011,12 @@
           <w:t xml:space="preserve"> RP-TX</w:t>
         </w:r>
       </w:hyperlink>
+      <w:r>
+        <w:rPr>
+          <w:rStyle w:val="Hyperlink"/>
+        </w:rPr>
+        <w:t xml:space="preserve"> with Adafruit STSPIN 220</w:t>
+      </w:r>
     </w:p>
     <w:p>
       <w:pPr>

</xml_diff>